<commit_message>
docs: update kaiti document with new content
</commit_message>
<xml_diff>
--- a/docs/kaiti/开题报告-邝黄硕.docx
+++ b/docs/kaiti/开题报告-邝黄硕.docx
@@ -1746,15 +1746,7 @@
               <w:rPr>
                 <w:rFonts w:hint="eastAsia"/>
               </w:rPr>
-              <w:t>以上措施可降低实验偶然性，提高结论可复验性，为论文</w:t>
-            </w:r>
-            <w:bookmarkStart w:id="8" w:name="_GoBack"/>
-            <w:bookmarkEnd w:id="8"/>
-            <w:r>
-              <w:rPr>
-                <w:rFonts w:hint="eastAsia"/>
-              </w:rPr>
-              <w:t>提供完整证据基础。</w:t>
+              <w:t>以上措施可降低实验偶然性，提高结论可复验性，为论文提供完整证据基础。</w:t>
             </w:r>
           </w:p>
           <w:bookmarkEnd w:id="3"/>
@@ -3455,6 +3447,8 @@
               </w:rPr>
               <w:t>实施可行性与风险控制</w:t>
             </w:r>
+            <w:bookmarkStart w:id="8" w:name="_GoBack"/>
+            <w:bookmarkEnd w:id="8"/>
           </w:p>
           <w:p>
             <w:pPr>

</xml_diff>